<commit_message>
Fix spelling consistency: use American English 'favorite' throughout
Co-authored-by: alanpaul1382-sketch <261784266+alanpaul1382-sketch@users.noreply.github.com>
</commit_message>
<xml_diff>
--- a/video-summary.docx
+++ b/video-summary.docx
@@ -499,7 +499,7 @@
           <w:color w:val="666666"/>
           <w:sz w:val="18"/>
         </w:rPr>
-        <w:t>The relationships between the five Straw Hat actors mirror the bonds of their characters. Note the playful rivalry between Zoro (Mackenyu) and Sanji (Taz Skylar), a fan-favourite dynamic that carries over from the anime and manga.</w:t>
+        <w:t>The relationships between the five Straw Hat actors mirror the bonds of their characters. Note the playful rivalry between Zoro (Mackenyu) and Sanji (Taz Skylar), a fan-favorite dynamic that carries over from the anime and manga.</w:t>
       </w:r>
     </w:p>
     <w:p>
@@ -527,7 +527,7 @@
         <w:rPr>
           <w:b/>
         </w:rPr>
-        <w:t>Favourite One Piece characters</w:t>
+        <w:t>Favorite One Piece characters</w:t>
       </w:r>
       <w:r>
         <w:t xml:space="preserve"> — Cast members revealed which characters from the anime and manga they personally connect with, sometimes choosing characters other than the ones they play.</w:t>
@@ -606,7 +606,7 @@
         <w:t>New character introductions</w:t>
       </w:r>
       <w:r>
-        <w:t xml:space="preserve"> — The cast expressed genuine excitement about earlier-than-expected introductions of fan-favourite characters such as Dragon, Sabo, and Brook. Mackenyu admitted to literally screaming when he first learned about these additions.</w:t>
+        <w:t xml:space="preserve"> — The cast expressed genuine excitement about earlier-than-expected introductions of fan-favorite characters such as Dragon, Sabo, and Brook. Mackenyu admitted to literally screaming when he first learned about these additions.</w:t>
       </w:r>
     </w:p>
     <w:p>

</xml_diff>